<commit_message>
update: sync latest generated forms and database
</commit_message>
<xml_diff>
--- a/115年7月/附件1_發票收據申請單_104版稅115年7月.docx
+++ b/115年7月/附件1_發票收據申請單_104版稅115年7月.docx
@@ -175,9 +175,101 @@
             </w:pPr>
             <w:r>
               <w:rPr>
-                <w:rFonts w:ascii="Arial" w:hAnsi="Arial"/>
-              </w:rPr>
-              <w:t>115年08月03日</w:t>
+                <w:rFonts w:ascii="Arial" w:hAnsi="Arial" w:cs="Arial"/>
+                <w:kern w:val="0"/>
+                <w:fitText w:val="400" w:id="-1563789054"/>
+              </w:rPr>
+              <w:fldChar w:fldCharType="begin">
+                <w:ffData>
+                  <w:name w:val="Text3"/>
+                  <w:enabled/>
+                  <w:calcOnExit w:val="0"/>
+                  <w:textInput>
+                    <w:maxLength w:val="3"/>
+                  </w:textInput>
+                </w:ffData>
+              </w:fldChar>
+            </w:r>
+            <w:r>
+              <w:rPr>
+                <w:rFonts w:ascii="Arial" w:hAnsi="Arial" w:cs="Arial"/>
+                <w:kern w:val="0"/>
+                <w:fitText w:val="400" w:id="-1563789054"/>
+              </w:rPr>
+              <w:instrText xml:space="preserve"> FORMTEXT</w:instrText>
+            </w:r>
+            <w:r>
+              <w:rPr>
+                <w:rFonts w:ascii="Arial" w:hAnsi="Arial" w:cs="Arial"/>
+              </w:rPr>
+            </w:r>
+            <w:r>
+              <w:rPr>
+                <w:rFonts w:ascii="Arial" w:hAnsi="Arial" w:cs="Arial"/>
+              </w:rPr>
+              <w:fldChar w:fldCharType="separate"/>
+            </w:r>
+            <w:r>
+              <w:rPr>
+                <w:rFonts w:ascii="Arial" w:hAnsi="Arial" w:cs="Arial" w:hint="eastAsia"/>
+              </w:rPr>
+              <w:t>11</w:t>
+            </w:r>
+            <w:r>
+              <w:rPr>
+                <w:rFonts w:ascii="Arial" w:hAnsi="Arial" w:cs="Arial" w:hint="eastAsia"/>
+              </w:rPr>
+              <w:t>5</w:t>
+            </w:r>
+            <w:r>
+              <w:rPr>
+                <w:rFonts w:ascii="Arial" w:hAnsi="Arial" w:cs="Arial"/>
+                <w:kern w:val="0"/>
+                <w:fitText w:val="401" w:id="-1563789055"/>
+              </w:rPr>
+              <w:fldChar w:fldCharType="end"/>
+            </w:r>
+            <w:bookmarkEnd w:id="1"/>
+            <w:r>
+              <w:rPr>
+                <w:rFonts w:ascii="Arial" w:hAnsi="Arial" w:cs="Arial" w:hint="eastAsia"/>
+                <w:kern w:val="0"/>
+              </w:rPr>
+              <w:t>年</w:t>
+            </w:r>
+            <w:r>
+              <w:rPr>
+                <w:rFonts w:ascii="Arial" w:hAnsi="Arial" w:cs="Arial" w:hint="eastAsia"/>
+                <w:kern w:val="0"/>
+              </w:rPr>
+              <w:t>0</w:t>
+            </w:r>
+            <w:r>
+              <w:rPr>
+                <w:rFonts w:ascii="Arial" w:hAnsi="Arial" w:cs="Arial" w:hint="eastAsia"/>
+                <w:kern w:val="0"/>
+              </w:rPr>
+              <w:t>9</w:t>
+            </w:r>
+            <w:r>
+              <w:rPr>
+                <w:rFonts w:hint="eastAsia"/>
+                <w:sz w:val="22"/>
+              </w:rPr>
+              <w:t>月</w:t>
+            </w:r>
+            <w:r>
+              <w:rPr>
+                <w:rFonts w:ascii="Arial" w:hAnsi="Arial" w:cs="Arial" w:hint="eastAsia"/>
+              </w:rPr>
+              <w:t>11</w:t>
+            </w:r>
+            <w:r>
+              <w:rPr>
+                <w:rFonts w:hint="eastAsia"/>
+                <w:sz w:val="22"/>
+              </w:rPr>
+              <w:t>日</w:t>
             </w:r>
           </w:p>
         </w:tc>
@@ -981,8 +1073,9 @@
             </w:pPr>
             <w:r>
               <w:rPr>
-                <w:rFonts w:ascii="Arial" w:hAnsi="Arial"/>
+                <w:rFonts w:ascii="Arial" w:hAnsi="Arial" w:cs="Arial" w:hint="eastAsia"/>
                 <w:b/>
+                <w:szCs w:val="24"/>
               </w:rPr>
               <w:t>一零四資訊科技股份有限公司</w:t>
             </w:r>
@@ -1035,10 +1128,34 @@
             </w:pPr>
             <w:r>
               <w:rPr>
-                <w:rFonts w:ascii="Arial" w:hAnsi="Arial"/>
-                <w:b/>
+                <w:rFonts w:ascii="Arial" w:hAnsi="Arial" w:cs="Arial" w:hint="eastAsia"/>
+                <w:szCs w:val="24"/>
               </w:rPr>
               <w:t>NT$944</w:t>
+            </w:r>
+            <w:r>
+              <w:rPr>
+                <w:rFonts w:ascii="Arial" w:hAnsi="Arial" w:cs="Arial" w:hint="eastAsia"/>
+                <w:szCs w:val="24"/>
+              </w:rPr>
+            </w:r>
+            <w:r>
+              <w:rPr>
+                <w:rFonts w:ascii="Arial" w:hAnsi="Arial" w:cs="Arial" w:hint="eastAsia"/>
+                <w:szCs w:val="24"/>
+              </w:rPr>
+            </w:r>
+            <w:r>
+              <w:rPr>
+                <w:rFonts w:ascii="Arial" w:hAnsi="Arial" w:cs="Arial" w:hint="eastAsia"/>
+                <w:szCs w:val="24"/>
+              </w:rPr>
+            </w:r>
+            <w:r>
+              <w:rPr>
+                <w:rFonts w:ascii="Arial" w:hAnsi="Arial" w:cs="Arial" w:hint="eastAsia"/>
+                <w:szCs w:val="24"/>
+              </w:rPr>
             </w:r>
           </w:p>
         </w:tc>
@@ -1159,10 +1276,91 @@
             </w:pPr>
             <w:r>
               <w:rPr>
-                <w:rFonts w:ascii="Arial" w:hAnsi="Arial"/>
-                <w:sz w:val="22"/>
-              </w:rPr>
-              <w:t>有統編，請填統編：84598349</w:t>
+                <w:rFonts w:ascii="Arial" w:hAnsi="Arial" w:cs="Arial"/>
+                <w:sz w:val="22"/>
+              </w:rPr>
+              <w:fldChar w:fldCharType="begin">
+                <w:ffData>
+                  <w:name w:val=""/>
+                  <w:enabled/>
+                  <w:calcOnExit w:val="0"/>
+                  <w:checkBox>
+                    <w:sizeAuto/>
+                    <w:default w:val="1"/>
+                  </w:checkBox>
+                </w:ffData>
+              </w:fldChar>
+            </w:r>
+            <w:r>
+              <w:rPr>
+                <w:rFonts w:ascii="Arial" w:hAnsi="Arial" w:cs="Arial"/>
+                <w:sz w:val="22"/>
+              </w:rPr>
+              <w:instrText xml:space="preserve"> FORMCHECKBOX </w:instrText>
+            </w:r>
+            <w:r>
+              <w:rPr>
+                <w:rFonts w:ascii="Arial" w:hAnsi="Arial" w:cs="Arial"/>
+                <w:sz w:val="22"/>
+              </w:rPr>
+            </w:r>
+            <w:r>
+              <w:rPr>
+                <w:rFonts w:ascii="Arial" w:hAnsi="Arial" w:cs="Arial"/>
+                <w:sz w:val="22"/>
+              </w:rPr>
+              <w:fldChar w:fldCharType="separate"/>
+            </w:r>
+            <w:r>
+              <w:rPr>
+                <w:rFonts w:ascii="Arial" w:hAnsi="Arial" w:cs="Arial"/>
+                <w:sz w:val="22"/>
+              </w:rPr>
+              <w:fldChar w:fldCharType="end"/>
+            </w:r>
+            <w:r>
+              <w:rPr>
+                <w:rFonts w:hint="eastAsia"/>
+                <w:sz w:val="22"/>
+              </w:rPr>
+              <w:t>有統編</w:t>
+            </w:r>
+            <w:r>
+              <w:rPr>
+                <w:rFonts w:hint="eastAsia"/>
+                <w:sz w:val="22"/>
+              </w:rPr>
+              <w:t>，</w:t>
+            </w:r>
+            <w:proofErr w:type="gramStart"/>
+            <w:r>
+              <w:rPr>
+                <w:rFonts w:hint="eastAsia"/>
+                <w:sz w:val="22"/>
+              </w:rPr>
+              <w:t>請填</w:t>
+            </w:r>
+            <w:r>
+              <w:rPr>
+                <w:rFonts w:hint="eastAsia"/>
+                <w:sz w:val="22"/>
+              </w:rPr>
+              <w:t>統編</w:t>
+            </w:r>
+            <w:proofErr w:type="gramEnd"/>
+            <w:r>
+              <w:rPr>
+                <w:rFonts w:hint="eastAsia"/>
+                <w:sz w:val="22"/>
+              </w:rPr>
+              <w:t>：</w:t>
+            </w:r>
+            <w:r>
+              <w:rPr>
+                <w:rFonts w:asciiTheme="majorEastAsia" w:eastAsiaTheme="majorEastAsia" w:hAnsiTheme="majorEastAsia"/>
+                <w:b/>
+              </w:rPr>
+              <w:t>84598349</w:t>
             </w:r>
           </w:p>
         </w:tc>
@@ -4421,9 +4619,80 @@
             </w:pPr>
             <w:r>
               <w:rPr>
-                <w:sz w:val="22"/>
-              </w:rPr>
-              <w:t>(預計) 115年09月30日</w:t>
+                <w:rFonts w:hint="eastAsia"/>
+                <w:sz w:val="22"/>
+              </w:rPr>
+              <w:t>(</w:t>
+            </w:r>
+            <w:r>
+              <w:rPr>
+                <w:rFonts w:hint="eastAsia"/>
+                <w:sz w:val="22"/>
+              </w:rPr>
+              <w:t>預計</w:t>
+            </w:r>
+            <w:r>
+              <w:rPr>
+                <w:rFonts w:hint="eastAsia"/>
+                <w:sz w:val="22"/>
+              </w:rPr>
+              <w:t>)</w:t>
+            </w:r>
+            <w:r>
+              <w:rPr>
+                <w:rFonts w:ascii="Arial" w:hAnsi="Arial" w:cs="Arial"/>
+                <w:sz w:val="22"/>
+              </w:rPr>
+              <w:t xml:space="preserve"> </w:t>
+            </w:r>
+            <w:r>
+              <w:rPr>
+                <w:rFonts w:ascii="Arial" w:hAnsi="Arial" w:cs="Arial"/>
+                <w:sz w:val="22"/>
+              </w:rPr>
+              <w:t>115年10月31日</w:t>
+            </w:r>
+            <w:r>
+              <w:rPr>
+                <w:rFonts w:ascii="Arial" w:hAnsi="Arial" w:cs="Arial" w:hint="eastAsia"/>
+                <w:sz w:val="22"/>
+              </w:rPr>
+            </w:r>
+            <w:r>
+              <w:rPr>
+                <w:rFonts w:hint="eastAsia"/>
+                <w:sz w:val="22"/>
+              </w:rPr>
+            </w:r>
+            <w:r>
+              <w:rPr>
+                <w:rFonts w:hint="eastAsia"/>
+                <w:sz w:val="22"/>
+              </w:rPr>
+            </w:r>
+            <w:r>
+              <w:rPr>
+                <w:rFonts w:hint="eastAsia"/>
+                <w:sz w:val="22"/>
+              </w:rPr>
+            </w:r>
+            <w:r>
+              <w:rPr>
+                <w:rFonts w:hint="eastAsia"/>
+                <w:sz w:val="22"/>
+              </w:rPr>
+            </w:r>
+            <w:r>
+              <w:rPr>
+                <w:rFonts w:hint="eastAsia"/>
+                <w:sz w:val="22"/>
+              </w:rPr>
+            </w:r>
+            <w:r>
+              <w:rPr>
+                <w:rFonts w:hint="eastAsia"/>
+                <w:sz w:val="22"/>
+              </w:rPr>
             </w:r>
           </w:p>
         </w:tc>

</xml_diff>